<commit_message>
Update NXT latest early BE and TradingView data
</commit_message>
<xml_diff>
--- a/latest/NXT_Latest_NXT35_BTC_BNB_SOL_FundingAdjusted_System_And_Indicators.docx
+++ b/latest/NXT_Latest_NXT35_BTC_BNB_SOL_FundingAdjusted_System_And_Indicators.docx
@@ -7,12 +7,12 @@
         <w:pStyle w:val="Title"/>
       </w:pPr>
       <w:r>
-        <w:t>NXT v3.5 Latest Portfolio - BTC BNB SOL</w:t>
+        <w:t>NXT v3.5 Latest Portfolio - BTC BNB SOL - Funding Adjusted</w:t>
       </w:r>
     </w:p>
     <w:p>
       <w:r>
-        <w:t>Current selected latest portfolio: BTCUSDT, BNBUSDT, and SOLUSDT.</w:t>
+        <w:t>Current selected TradingView BINANCE native 1D portfolio with Binance USD-M perpetual funding audit.</w:t>
       </w:r>
     </w:p>
     <w:tbl>
@@ -64,7 +64,7 @@
           </w:tcPr>
           <w:p>
             <w:r>
-              <w:t>NXT v3.5 Portfolio BTC+BNB+SOL + Binance Native 1D + SSL14 + Runner A + Anti-Immediate-Reversal + LONG-only Pullback Continuation + No Risk-Off</w:t>
+              <w:t>NXT v3.5 Portfolio BTC+BNB+SOL + TradingView BINANCE native 1D + SSL14 + Runner A + Early-BE 7% + Anti-Immediate-Reversal + LONG-only Pullback Continuation + No Risk-Off + funding-adjusted audit</w:t>
             </w:r>
           </w:p>
         </w:tc>
@@ -108,7 +108,7 @@
           </w:tcPr>
           <w:p>
             <w:r>
-              <w:t>269</w:t>
+              <w:t>281</w:t>
             </w:r>
           </w:p>
         </w:tc>
@@ -130,7 +130,7 @@
           </w:tcPr>
           <w:p>
             <w:r>
-              <w:t>163.03R</w:t>
+              <w:t>158.54R</w:t>
             </w:r>
           </w:p>
         </w:tc>
@@ -152,7 +152,7 @@
           </w:tcPr>
           <w:p>
             <w:r>
-              <w:t>-9.91R</w:t>
+              <w:t>-8.67R</w:t>
             </w:r>
           </w:p>
         </w:tc>
@@ -174,7 +174,7 @@
           </w:tcPr>
           <w:p>
             <w:r>
-              <w:t>45.72%</w:t>
+              <w:t>42.35%</w:t>
             </w:r>
           </w:p>
         </w:tc>
@@ -196,7 +196,7 @@
           </w:tcPr>
           <w:p>
             <w:r>
-              <w:t>2.38</w:t>
+              <w:t>2.48</w:t>
             </w:r>
           </w:p>
         </w:tc>
@@ -240,7 +240,51 @@
           </w:tcPr>
           <w:p>
             <w:r>
-              <w:t>$183,032.16</w:t>
+              <w:t>$178,535.77</w:t>
+            </w:r>
+          </w:p>
+        </w:tc>
+      </w:tr>
+      <w:tr>
+        <w:tc>
+          <w:tcPr>
+            <w:tcW w:type="dxa" w:w="4320"/>
+          </w:tcPr>
+          <w:p>
+            <w:r>
+              <w:t>Original Total R</w:t>
+            </w:r>
+          </w:p>
+        </w:tc>
+        <w:tc>
+          <w:tcPr>
+            <w:tcW w:type="dxa" w:w="4320"/>
+          </w:tcPr>
+          <w:p>
+            <w:r>
+              <w:t>167.66R</w:t>
+            </w:r>
+          </w:p>
+        </w:tc>
+      </w:tr>
+      <w:tr>
+        <w:tc>
+          <w:tcPr>
+            <w:tcW w:type="dxa" w:w="4320"/>
+          </w:tcPr>
+          <w:p>
+            <w:r>
+              <w:t>Funding R</w:t>
+            </w:r>
+          </w:p>
+        </w:tc>
+        <w:tc>
+          <w:tcPr>
+            <w:tcW w:type="dxa" w:w="4320"/>
+          </w:tcPr>
+          <w:p>
+            <w:r>
+              <w:t>-9.12R</w:t>
             </w:r>
           </w:p>
         </w:tc>
@@ -259,7 +303,7 @@
         <w:pStyle w:val="ListBullet"/>
       </w:pPr>
       <w:r>
-        <w:t>Data: Binance native 1D candles for BTCUSDT, BNBUSDT, and SOLUSDT.</w:t>
+        <w:t>Data: Binance spot native 1D candles (00:00 UTC session), matching TradingView BINANCE symbols on the 1D timeframe.</w:t>
       </w:r>
     </w:p>
     <w:p>
@@ -332,6 +376,14 @@
       </w:pPr>
       <w:r>
         <w:t>Initial stop: 1.5 ATR14 from entry.</w:t>
+      </w:r>
+    </w:p>
+    <w:p>
+      <w:pPr>
+        <w:pStyle w:val="ListBullet"/>
+      </w:pPr>
+      <w:r>
+        <w:t>Early-BE 7%: before TP1, if LONG High reaches entry x 1.07 or SHORT Low reaches entry x 0.93, move the full-position stop to entry starting from the next daily candle.</w:t>
       </w:r>
     </w:p>
     <w:p>

</xml_diff>

<commit_message>
Update NXT latest scanner and research artifacts
</commit_message>
<xml_diff>
--- a/latest/NXT_Latest_NXT35_BTC_BNB_SOL_FundingAdjusted_System_And_Indicators.docx
+++ b/latest/NXT_Latest_NXT35_BTC_BNB_SOL_FundingAdjusted_System_And_Indicators.docx
@@ -64,7 +64,7 @@
           </w:tcPr>
           <w:p>
             <w:r>
-              <w:t>NXT v3.5 Portfolio BTC+BNB+SOL + TradingView BINANCE native 1D + SSL14 + Runner A + Early-BE 7% + Anti-Immediate-Reversal + LONG-only Pullback Continuation + No Risk-Off + funding-adjusted audit</w:t>
+              <w:t>NXT v3.5 Portfolio BTC+BNB+SOL + TradingView BINANCE native 1D + SSL14 + Runner A + Early-BE 7% + Anti-Immediate-Reversal + LONG-only Pullback Continuation on SSL Bullish Flip + No Risk-Off + funding-adjusted audit</w:t>
             </w:r>
           </w:p>
         </w:tc>
@@ -108,7 +108,7 @@
           </w:tcPr>
           <w:p>
             <w:r>
-              <w:t>281</w:t>
+              <w:t>250</w:t>
             </w:r>
           </w:p>
         </w:tc>
@@ -130,7 +130,7 @@
           </w:tcPr>
           <w:p>
             <w:r>
-              <w:t>158.54R</w:t>
+              <w:t>154.97R</w:t>
             </w:r>
           </w:p>
         </w:tc>
@@ -174,7 +174,7 @@
           </w:tcPr>
           <w:p>
             <w:r>
-              <w:t>42.35%</w:t>
+              <w:t>45.60%</w:t>
             </w:r>
           </w:p>
         </w:tc>
@@ -196,7 +196,7 @@
           </w:tcPr>
           <w:p>
             <w:r>
-              <w:t>2.48</w:t>
+              <w:t>2.63</w:t>
             </w:r>
           </w:p>
         </w:tc>
@@ -240,7 +240,7 @@
           </w:tcPr>
           <w:p>
             <w:r>
-              <w:t>$178,535.77</w:t>
+              <w:t>$174,967.27</w:t>
             </w:r>
           </w:p>
         </w:tc>
@@ -262,7 +262,7 @@
           </w:tcPr>
           <w:p>
             <w:r>
-              <w:t>167.66R</w:t>
+              <w:t>163.48R</w:t>
             </w:r>
           </w:p>
         </w:tc>
@@ -284,7 +284,7 @@
           </w:tcPr>
           <w:p>
             <w:r>
-              <w:t>-9.12R</w:t>
+              <w:t>-8.52R</w:t>
             </w:r>
           </w:p>
         </w:tc>
@@ -343,7 +343,7 @@
         <w:pStyle w:val="ListBullet"/>
       </w:pPr>
       <w:r>
-        <w:t>Continuation LONG: SSL is bullish, close &gt; EMA20 &gt; EMA50, low touched EMA20 within the last 5 candles, close &gt; EMA20, and close &gt; previous close.</w:t>
+        <w:t>Continuation LONG: SSL flips bullish on the signal candle, close &gt; EMA20 &gt; EMA50, low touched EMA20 within the last 5 candles, close &gt; EMA20, and close &gt; previous close.</w:t>
       </w:r>
     </w:p>
     <w:p>
@@ -383,7 +383,7 @@
         <w:pStyle w:val="ListBullet"/>
       </w:pPr>
       <w:r>
-        <w:t>Early-BE 7%: before TP1, if LONG High reaches entry x 1.07 or SHORT Low reaches entry x 0.93, move the full-position stop to entry starting from the next daily candle.</w:t>
+        <w:t>Early-BE 7%: before TP1, from the first daily candle after entry onward, if LONG High reaches entry x 1.07 or SHORT Low reaches entry x 0.93, move the full-position stop to entry starting from the next daily candle.</w:t>
       </w:r>
     </w:p>
     <w:p>

</xml_diff>